<commit_message>
feat: standardize typography, multi-section DOCX pagination, and update Typst docs
</commit_message>
<xml_diff>
--- a/reference.docx
+++ b/reference.docx
@@ -314,6 +314,7 @@
       </w:r>
     </w:p>
     <w:sectPr>
+      <w:footerReference r:id="rIdF1" w:type="default"/>
       <w:footnotePr>
         <w:numRestart w:val="eachSect"/>
       </w:footnotePr>
@@ -326,6 +327,31 @@
 
 <file path=word/comments.xml><?xml version="1.0" encoding="utf-8"?>
 <w:comments xmlns:w="http://schemas.openxmlformats.org/wordprocessingml/2006/main" xmlns:m="http://schemas.openxmlformats.org/officeDocument/2006/math" xmlns:r="http://schemas.openxmlformats.org/officeDocument/2006/relationships" xmlns:o="urn:schemas-microsoft-com:office:office" xmlns:v="urn:schemas-microsoft-com:vml" xmlns:w10="urn:schemas-microsoft-com:office:word" xmlns:a="http://schemas.openxmlformats.org/drawingml/2006/main" xmlns:pic="http://schemas.openxmlformats.org/drawingml/2006/picture" xmlns:wp="http://schemas.openxmlformats.org/drawingml/2006/wordprocessingDrawing"/>
+</file>
+
+<file path=word/footer1.xml><?xml version="1.0" encoding="utf-8"?>
+<w:ftr xmlns:w="http://schemas.openxmlformats.org/wordprocessingml/2006/main">
+  <w:p>
+    <w:pPr>
+      <w:jc w:val="center"/>
+    </w:pPr>
+    <w:r>
+      <w:fldChar w:fldCharType="begin"/>
+    </w:r>
+    <w:r>
+      <w:instrText xml:space="preserve"> PAGE </w:instrText>
+    </w:r>
+    <w:r>
+      <w:fldChar w:fldCharType="separate"/>
+    </w:r>
+    <w:r>
+      <w:t>1</w:t>
+    </w:r>
+    <w:r>
+      <w:fldChar w:fldCharType="end"/>
+    </w:r>
+  </w:p>
+</w:ftr>
 </file>
 
 <file path=word/footnotes.xml><?xml version="1.0" encoding="utf-8"?>
@@ -519,22 +545,46 @@
     <w:link w:val="BodyTextChar"/>
     <w:qFormat/>
     <w:pPr>
-      <w:spacing w:before="180" w:after="180"/>
-    </w:pPr>
-  </w:style>
-  <w:style w:type="paragraph" w:customStyle="1" w:styleId="FirstParagraph">
+      <w:spacing w:after="0" w:line="360" w:lineRule="auto"/>
+      <w:ind w:firstLine="709"/>
+      <w:jc w:val="both"/>
+    </w:pPr>
+    <w:rPr>
+      <w:rFonts w:ascii="Times New Roman" w:hAnsi="Times New Roman" w:cs="Times New Roman"/>
+      <w:sz w:val="24"/>
+      <w:szCs w:val="24"/>
+    </w:rPr>
+  </w:style>
+  <w:style w:type="paragraph" w:styleId="FirstParagraph">
     <w:name w:val="First Paragraph"/>
     <w:basedOn w:val="BodyText"/>
-    <w:next w:val="BodyText"/>
-    <w:qFormat/>
+    <w:link w:val="BodyTextChar"/>
+    <w:qFormat/>
+    <w:pPr>
+      <w:spacing w:after="0" w:line="360" w:lineRule="auto"/>
+      <w:ind w:firstLine="709"/>
+      <w:jc w:val="both"/>
+    </w:pPr>
+    <w:rPr>
+      <w:rFonts w:ascii="Times New Roman" w:hAnsi="Times New Roman" w:cs="Times New Roman"/>
+      <w:sz w:val="24"/>
+      <w:szCs w:val="24"/>
+    </w:rPr>
   </w:style>
   <w:style w:type="paragraph" w:customStyle="1" w:styleId="Compact">
     <w:name w:val="Compact"/>
-    <w:basedOn w:val="BodyText"/>
-    <w:qFormat/>
-    <w:pPr>
-      <w:spacing w:before="36" w:after="36"/>
-    </w:pPr>
+    <w:basedOn w:val="Normal"/>
+    <w:qFormat/>
+    <w:pPr>
+      <w:spacing w:before="60" w:after="60" w:line="240" w:lineRule="auto"/>
+      <w:ind w:left="0" w:right="0" w:firstLine="0"/>
+      <w:jc w:val="left"/>
+    </w:pPr>
+    <w:rPr>
+      <w:rFonts w:ascii="Times New Roman" w:hAnsi="Times New Roman" w:cs="Times New Roman"/>
+      <w:sz w:val="24"/>
+      <w:szCs w:val="24"/>
+    </w:rPr>
   </w:style>
   <w:style w:type="paragraph" w:styleId="Title">
     <w:name w:val="Title"/>
@@ -679,10 +729,17 @@
   <w:style w:type="paragraph" w:styleId="Bibliography">
     <w:name w:val="Bibliography"/>
     <w:basedOn w:val="Normal"/>
-    <w:next w:val="Bibliography"/>
-    <w:qFormat/>
-    <w:pPr/>
-    <w:rPr/>
+    <w:qFormat/>
+    <w:pPr>
+      <w:spacing w:after="120" w:line="360" w:lineRule="auto"/>
+      <w:ind w:left="709" w:hanging="709"/>
+      <w:jc w:val="both"/>
+    </w:pPr>
+    <w:rPr>
+      <w:rFonts w:ascii="Times New Roman" w:hAnsi="Times New Roman" w:cs="Times New Roman"/>
+      <w:sz w:val="24"/>
+      <w:szCs w:val="24"/>
+    </w:rPr>
   </w:style>
   <w:style w:type="paragraph" w:styleId="Heading1">
     <w:name w:val="heading 1"/>
@@ -694,7 +751,7 @@
     <w:pPr>
       <w:keepNext/>
       <w:keepLines/>
-      <w:spacing w:before="360" w:after="120"/>
+      <w:spacing w:before="360" w:after="720"/>
       <w:jc w:val="center"/>
       <w:outlineLvl w:val="0"/>
     </w:pPr>
@@ -1004,15 +1061,20 @@
   </w:style>
   <w:style w:type="paragraph" w:styleId="BlockText">
     <w:name w:val="Block Text"/>
-    <w:basedOn w:val="BodyText"/>
-    <w:next w:val="BodyText"/>
-    <w:uiPriority w:val="9"/>
-    <w:unhideWhenUsed/>
-    <w:qFormat/>
-    <w:pPr>
-      <w:spacing w:before="100" w:after="100"/>
-      <w:ind w:firstLine="0" w:left="480" w:right="480"/>
-    </w:pPr>
+    <w:basedOn w:val="Normal"/>
+    <w:next w:val="Normal"/>
+    <w:qFormat/>
+    <w:pPr>
+      <w:spacing w:before="120" w:after="120" w:line="240" w:lineRule="auto"/>
+      <w:ind w:left="720" w:right="720" w:firstLine="0"/>
+      <w:jc w:val="both"/>
+    </w:pPr>
+    <w:rPr>
+      <w:rFonts w:ascii="Times New Roman" w:hAnsi="Times New Roman" w:cs="Times New Roman"/>
+      <w:sz w:val="24"/>
+      <w:szCs w:val="24"/>
+      <w:i/>
+    </w:rPr>
   </w:style>
   <w:style w:type="paragraph" w:styleId="FootnoteText">
     <w:name w:val="Footnote Text"/>
@@ -1039,36 +1101,49 @@
     <w:semiHidden/>
     <w:unhideWhenUsed/>
   </w:style>
-  <w:style w:type="table" w:default="1" w:styleId="Table">
+  <w:style w:type="table" w:styleId="Table">
     <w:name w:val="Table"/>
     <w:basedOn w:val="TableNormal"/>
-    <w:semiHidden/>
-    <w:unhideWhenUsed/>
+    <w:uiPriority w:val="59"/>
     <w:qFormat/>
     <w:tblPr>
-      <w:tblInd w:w="0" w:type="dxa"/>
+      <w:tblInd w:type="dxa" w:w="0"/>
+      <w:tblBorders>
+        <w:top w:val="single" w:sz="4" w:space="0" w:color="8C8C8C"/>
+        <w:left w:val="single" w:sz="4" w:space="0" w:color="8C8C8C"/>
+        <w:bottom w:val="single" w:sz="4" w:space="0" w:color="8C8C8C"/>
+        <w:right w:val="single" w:sz="4" w:space="0" w:color="8C8C8C"/>
+        <w:insideH w:val="single" w:sz="4" w:space="0" w:color="8C8C8C"/>
+        <w:insideV w:val="single" w:sz="4" w:space="0" w:color="8C8C8C"/>
+      </w:tblBorders>
       <w:tblCellMar>
-        <w:top w:w="0" w:type="dxa"/>
-        <w:left w:w="108" w:type="dxa"/>
-        <w:bottom w:w="0" w:type="dxa"/>
-        <w:right w:w="108" w:type="dxa"/>
+        <w:top w:type="dxa" w:w="80"/>
+        <w:left w:type="dxa" w:w="120"/>
+        <w:bottom w:type="dxa" w:w="80"/>
+        <w:right w:type="dxa" w:w="120"/>
       </w:tblCellMar>
     </w:tblPr>
     <w:tblStylePr w:type="firstRow">
-      <w:tblPr>
+      <w:pPr>
         <w:jc w:val="left"/>
-        <w:tblInd w:w="0" w:type="dxa"/>
-      </w:tblPr>
-      <w:trPr>
-        <w:jc w:val="left"/>
-      </w:trPr>
+        <w:spacing w:before="60" w:after="60" w:line="240" w:lineRule="auto"/>
+        <w:ind w:left="0" w:right="0" w:firstLine="0"/>
+      </w:pPr>
+      <w:rPr>
+        <w:b/>
+        <w:bCs/>
+      </w:rPr>
       <w:tcPr>
-        <w:tcBorders>
-          <w:bottom w:val="single"/>
-        </w:tcBorders>
-        <w:vAlign w:val="bottom"/>
+        <w:vAlign w:val="center"/>
       </w:tcPr>
     </w:tblStylePr>
+    <w:tblStylePr w:type="lastRow"/>
+    <w:tblStylePr w:type="firstCol"/>
+    <w:tblStylePr w:type="lastCol"/>
+    <w:tblStylePr w:type="band1Vert"/>
+    <w:tblStylePr w:type="band2Vert"/>
+    <w:tblStylePr w:type="band1Horz"/>
+    <w:tblStylePr w:type="band2Horz"/>
   </w:style>
   <w:style w:type="paragraph" w:customStyle="1" w:styleId="DefinitionTerm">
     <w:name w:val="Definition Term"/>
@@ -1100,14 +1175,36 @@
   </w:style>
   <w:style w:type="paragraph" w:customStyle="1" w:styleId="TableCaption">
     <w:name w:val="Table Caption"/>
-    <w:basedOn w:val="Caption"/>
+    <w:basedOn w:val="Normal"/>
+    <w:qFormat/>
     <w:pPr>
       <w:keepNext/>
-    </w:pPr>
+      <w:spacing w:before="240" w:after="120" w:line="240" w:lineRule="auto"/>
+      <w:ind w:left="0" w:right="0" w:firstLine="0"/>
+      <w:jc w:val="left"/>
+    </w:pPr>
+    <w:rPr>
+      <w:rFonts w:ascii="Times New Roman" w:hAnsi="Times New Roman" w:cs="Times New Roman"/>
+      <w:sz w:val="24"/>
+      <w:szCs w:val="24"/>
+      <w:i/>
+    </w:rPr>
   </w:style>
   <w:style w:type="paragraph" w:customStyle="1" w:styleId="ImageCaption">
     <w:name w:val="Image Caption"/>
-    <w:basedOn w:val="Caption"/>
+    <w:basedOn w:val="Normal"/>
+    <w:qFormat/>
+    <w:pPr>
+      <w:spacing w:before="120" w:after="240" w:line="240" w:lineRule="auto"/>
+      <w:ind w:left="0" w:right="0" w:firstLine="0"/>
+      <w:jc w:val="center"/>
+    </w:pPr>
+    <w:rPr>
+      <w:rFonts w:ascii="Times New Roman" w:hAnsi="Times New Roman" w:cs="Times New Roman"/>
+      <w:sz w:val="24"/>
+      <w:szCs w:val="24"/>
+      <w:i/>
+    </w:rPr>
   </w:style>
   <w:style w:type="paragraph" w:customStyle="1" w:styleId="Figure">
     <w:name w:val="Figure"/>
@@ -1167,6 +1264,166 @@
       <w:b w:val="0"/>
       <w:bCs w:val="0"/>
       <w:color w:val="365F91" w:themeColor="accent1" w:themeShade="BF"/>
+    </w:rPr>
+  </w:style>
+  <w:style w:type="paragraph" w:styleId="SourceCode">
+    <w:name w:val="Source Code"/>
+    <w:basedOn w:val="Normal"/>
+    <w:qFormat/>
+    <w:pPr>
+      <w:spacing w:before="120" w:after="120" w:line="240" w:lineRule="auto"/>
+      <w:ind w:left="0" w:right="0" w:firstLine="0"/>
+      <w:jc w:val="left"/>
+    </w:pPr>
+    <w:rPr>
+      <w:rFonts w:ascii="DejaVu Sans Mono" w:hAnsi="DejaVu Sans Mono" w:cs="DejaVu Sans Mono"/>
+      <w:sz w:val="18"/>
+      <w:szCs w:val="18"/>
+    </w:rPr>
+  </w:style>
+  <w:style w:type="paragraph" w:styleId="TOC1">
+    <w:name w:val="toc 1"/>
+    <w:basedOn w:val="Normal"/>
+    <w:next w:val="Normal"/>
+    <w:qFormat/>
+    <w:pPr>
+      <w:spacing w:before="60" w:after="20" w:line="260" w:lineRule="auto"/>
+      <w:jc w:val="left"/>
+    </w:pPr>
+    <w:rPr>
+      <w:rFonts w:ascii="Times New Roman" w:hAnsi="Times New Roman" w:cs="Times New Roman"/>
+      <w:color w:val="000000"/>
+      <w:sz w:val="24"/>
+      <w:szCs w:val="24"/>
+      <w:b/>
+      <w:bCs/>
+    </w:rPr>
+  </w:style>
+  <w:style w:type="paragraph" w:styleId="TOC2">
+    <w:name w:val="toc 2"/>
+    <w:basedOn w:val="TOC1"/>
+    <w:next w:val="Normal"/>
+    <w:qFormat/>
+    <w:pPr>
+      <w:spacing w:before="0" w:after="0" w:line="240" w:lineRule="auto"/>
+      <w:jc w:val="left"/>
+    </w:pPr>
+    <w:rPr>
+      <w:b w:val="0"/>
+      <w:bCs w:val="0"/>
+    </w:rPr>
+  </w:style>
+  <w:style w:type="paragraph" w:styleId="TOC3">
+    <w:name w:val="toc 3"/>
+    <w:basedOn w:val="TOC2"/>
+    <w:next w:val="Normal"/>
+    <w:qFormat/>
+    <w:pPr>
+      <w:spacing w:before="0" w:after="0" w:line="240" w:lineRule="auto"/>
+      <w:jc w:val="left"/>
+    </w:pPr>
+    <w:rPr>
+      <w:b w:val="0"/>
+      <w:bCs w:val="0"/>
+    </w:rPr>
+  </w:style>
+  <w:style w:type="paragraph" w:customStyle="1" w:styleId="CoverImage">
+    <w:name w:val="CoverImage"/>
+    <w:basedOn w:val="Normal"/>
+    <w:qFormat/>
+    <w:pPr>
+      <w:spacing w:after="0"/>
+      <w:jc w:val="center"/>
+    </w:pPr>
+  </w:style>
+  <w:style w:type="paragraph" w:customStyle="1" w:styleId="CoverTitle">
+    <w:name w:val="CoverTitle"/>
+    <w:basedOn w:val="Normal"/>
+    <w:qFormat/>
+    <w:pPr>
+      <w:spacing w:before="567" w:after="0" w:line="300" w:lineRule="auto"/>
+      <w:jc w:val="center"/>
+    </w:pPr>
+    <w:rPr>
+      <w:rFonts w:ascii="Times New Roman" w:hAnsi="Times New Roman" w:cs="Times New Roman"/>
+      <w:color w:val="000000"/>
+      <w:sz w:val="28"/>
+      <w:szCs w:val="28"/>
+      <w:b/>
+      <w:bCs/>
+    </w:rPr>
+  </w:style>
+  <w:style w:type="paragraph" w:customStyle="1" w:styleId="CoverSubtitle">
+    <w:name w:val="CoverSubtitle"/>
+    <w:basedOn w:val="Normal"/>
+    <w:qFormat/>
+    <w:pPr>
+      <w:spacing w:before="170" w:after="0" w:line="300" w:lineRule="auto"/>
+      <w:jc w:val="center"/>
+    </w:pPr>
+    <w:rPr>
+      <w:rFonts w:ascii="Times New Roman" w:hAnsi="Times New Roman" w:cs="Times New Roman"/>
+      <w:color w:val="000000"/>
+      <w:sz w:val="28"/>
+      <w:szCs w:val="28"/>
+      <w:b/>
+      <w:bCs/>
+    </w:rPr>
+  </w:style>
+  <w:style w:type="paragraph" w:customStyle="1" w:styleId="CoverCourse">
+    <w:name w:val="CoverCourse"/>
+    <w:basedOn w:val="CoverLine"/>
+    <w:qFormat/>
+    <w:pPr>
+      <w:spacing w:before="454" w:after="0" w:line="300" w:lineRule="auto"/>
+    </w:pPr>
+  </w:style>
+  <w:style w:type="paragraph" w:customStyle="1" w:styleId="CoverLecturer">
+    <w:name w:val="CoverLecturer"/>
+    <w:basedOn w:val="CoverLine"/>
+    <w:qFormat/>
+    <w:pPr>
+      <w:spacing w:before="227" w:after="0" w:line="300" w:lineRule="auto"/>
+    </w:pPr>
+  </w:style>
+  <w:style w:type="paragraph" w:customStyle="1" w:styleId="CoverName">
+    <w:name w:val="CoverName"/>
+    <w:basedOn w:val="CoverLine"/>
+    <w:qFormat/>
+    <w:pPr>
+      <w:spacing w:before="170" w:after="0" w:line="300" w:lineRule="auto"/>
+    </w:pPr>
+  </w:style>
+  <w:style w:type="paragraph" w:customStyle="1" w:styleId="CoverLine">
+    <w:name w:val="CoverLine"/>
+    <w:basedOn w:val="Normal"/>
+    <w:qFormat/>
+    <w:pPr>
+      <w:spacing w:after="0" w:line="300" w:lineRule="auto"/>
+      <w:jc w:val="center"/>
+    </w:pPr>
+    <w:rPr>
+      <w:rFonts w:ascii="Times New Roman" w:hAnsi="Times New Roman" w:cs="Times New Roman"/>
+      <w:color w:val="000000"/>
+      <w:sz w:val="24"/>
+      <w:szCs w:val="24"/>
+    </w:rPr>
+  </w:style>
+  <w:style w:type="paragraph" w:customStyle="1" w:styleId="CoverInstitution">
+    <w:name w:val="CoverInstitution"/>
+    <w:basedOn w:val="Normal"/>
+    <w:qFormat/>
+    <w:pPr>
+      <w:spacing w:after="0" w:line="300" w:lineRule="auto"/>
+      <w:jc w:val="center"/>
+    </w:pPr>
+    <w:rPr>
+      <w:rFonts w:ascii="Times New Roman" w:hAnsi="Times New Roman" w:cs="Times New Roman"/>
+      <w:color w:val="000000"/>
+      <w:sz w:val="28"/>
+      <w:szCs w:val="28"/>
+      <w:b/>
+      <w:bCs/>
     </w:rPr>
   </w:style>
 </w:styles>

</xml_diff>